<commit_message>
Changed the reference level from topt1 to top2 for aphanomyces depending on the strain
</commit_message>
<xml_diff>
--- a/Knitted_Markdowns/Aphanomyces_euteiches_multiple_strains.docx
+++ b/Knitted_Markdowns/Aphanomyces_euteiches_multiple_strains.docx
@@ -16,6 +16,242 @@
       </w:pPr>
       <w:r>
         <w:t xml:space="preserve">Elvire Bestion, Margot Trinquier, Delphine Legrand</w:t>
+      </w:r>
+    </w:p>
+    <w:p>
+      <w:pPr>
+        <w:pStyle w:val="SourceCode"/>
+      </w:pPr>
+      <w:r>
+        <w:rPr>
+          <w:rStyle w:val="VerbatimChar"/>
+        </w:rPr>
+        <w:t xml:space="preserve">## ── Attaching core tidyverse packages ──────────────────────────────────────────────────────────────────── tidyverse 2.0.0 ──</w:t>
+      </w:r>
+      <w:r>
+        <w:br/>
+      </w:r>
+      <w:r>
+        <w:rPr>
+          <w:rStyle w:val="VerbatimChar"/>
+        </w:rPr>
+        <w:t xml:space="preserve">## ✔ dplyr     1.1.4     ✔ readr     2.1.5</w:t>
+      </w:r>
+      <w:r>
+        <w:br/>
+      </w:r>
+      <w:r>
+        <w:rPr>
+          <w:rStyle w:val="VerbatimChar"/>
+        </w:rPr>
+        <w:t xml:space="preserve">## ✔ forcats   1.0.0     ✔ stringr   1.5.1</w:t>
+      </w:r>
+      <w:r>
+        <w:br/>
+      </w:r>
+      <w:r>
+        <w:rPr>
+          <w:rStyle w:val="VerbatimChar"/>
+        </w:rPr>
+        <w:t xml:space="preserve">## ✔ ggplot2   4.0.2     ✔ tibble    3.2.1</w:t>
+      </w:r>
+      <w:r>
+        <w:br/>
+      </w:r>
+      <w:r>
+        <w:rPr>
+          <w:rStyle w:val="VerbatimChar"/>
+        </w:rPr>
+        <w:t xml:space="preserve">## ✔ lubridate 1.9.3     ✔ tidyr     1.3.1</w:t>
+      </w:r>
+      <w:r>
+        <w:br/>
+      </w:r>
+      <w:r>
+        <w:rPr>
+          <w:rStyle w:val="VerbatimChar"/>
+        </w:rPr>
+        <w:t xml:space="preserve">## ✔ purrr     1.0.2     </w:t>
+      </w:r>
+      <w:r>
+        <w:br/>
+      </w:r>
+      <w:r>
+        <w:rPr>
+          <w:rStyle w:val="VerbatimChar"/>
+        </w:rPr>
+        <w:t xml:space="preserve">## ── Conflicts ────────────────────────────────────────────────────────────────────────────────────── tidyverse_conflicts() ──</w:t>
+      </w:r>
+      <w:r>
+        <w:br/>
+      </w:r>
+      <w:r>
+        <w:rPr>
+          <w:rStyle w:val="VerbatimChar"/>
+        </w:rPr>
+        <w:t xml:space="preserve">## ✖ dplyr::filter() masks stats::filter()</w:t>
+      </w:r>
+      <w:r>
+        <w:br/>
+      </w:r>
+      <w:r>
+        <w:rPr>
+          <w:rStyle w:val="VerbatimChar"/>
+        </w:rPr>
+        <w:t xml:space="preserve">## ✖ dplyr::lag()    masks stats::lag()</w:t>
+      </w:r>
+      <w:r>
+        <w:br/>
+      </w:r>
+      <w:r>
+        <w:rPr>
+          <w:rStyle w:val="VerbatimChar"/>
+        </w:rPr>
+        <w:t xml:space="preserve">## ℹ Use the conflicted package (&lt;http://conflicted.r-lib.org/&gt;) to force all conflicts to become errors</w:t>
+      </w:r>
+      <w:r>
+        <w:br/>
+      </w:r>
+      <w:r>
+        <w:rPr>
+          <w:rStyle w:val="VerbatimChar"/>
+        </w:rPr>
+        <w:t xml:space="preserve">## Loading required package: Matrix</w:t>
+      </w:r>
+      <w:r>
+        <w:br/>
+      </w:r>
+      <w:r>
+        <w:rPr>
+          <w:rStyle w:val="VerbatimChar"/>
+        </w:rPr>
+        <w:t xml:space="preserve">## </w:t>
+      </w:r>
+      <w:r>
+        <w:br/>
+      </w:r>
+      <w:r>
+        <w:rPr>
+          <w:rStyle w:val="VerbatimChar"/>
+        </w:rPr>
+        <w:t xml:space="preserve">## </w:t>
+      </w:r>
+      <w:r>
+        <w:br/>
+      </w:r>
+      <w:r>
+        <w:rPr>
+          <w:rStyle w:val="VerbatimChar"/>
+        </w:rPr>
+        <w:t xml:space="preserve">## Attaching package: 'Matrix'</w:t>
+      </w:r>
+      <w:r>
+        <w:br/>
+      </w:r>
+      <w:r>
+        <w:rPr>
+          <w:rStyle w:val="VerbatimChar"/>
+        </w:rPr>
+        <w:t xml:space="preserve">## </w:t>
+      </w:r>
+      <w:r>
+        <w:br/>
+      </w:r>
+      <w:r>
+        <w:rPr>
+          <w:rStyle w:val="VerbatimChar"/>
+        </w:rPr>
+        <w:t xml:space="preserve">## </w:t>
+      </w:r>
+      <w:r>
+        <w:br/>
+      </w:r>
+      <w:r>
+        <w:rPr>
+          <w:rStyle w:val="VerbatimChar"/>
+        </w:rPr>
+        <w:t xml:space="preserve">## The following objects are masked from 'package:tidyr':</w:t>
+      </w:r>
+      <w:r>
+        <w:br/>
+      </w:r>
+      <w:r>
+        <w:rPr>
+          <w:rStyle w:val="VerbatimChar"/>
+        </w:rPr>
+        <w:t xml:space="preserve">## </w:t>
+      </w:r>
+      <w:r>
+        <w:br/>
+      </w:r>
+      <w:r>
+        <w:rPr>
+          <w:rStyle w:val="VerbatimChar"/>
+        </w:rPr>
+        <w:t xml:space="preserve">##     expand, pack, unpack</w:t>
+      </w:r>
+      <w:r>
+        <w:br/>
+      </w:r>
+      <w:r>
+        <w:rPr>
+          <w:rStyle w:val="VerbatimChar"/>
+        </w:rPr>
+        <w:t xml:space="preserve">## </w:t>
+      </w:r>
+      <w:r>
+        <w:br/>
+      </w:r>
+      <w:r>
+        <w:rPr>
+          <w:rStyle w:val="VerbatimChar"/>
+        </w:rPr>
+        <w:t xml:space="preserve">## </w:t>
+      </w:r>
+      <w:r>
+        <w:br/>
+      </w:r>
+      <w:r>
+        <w:rPr>
+          <w:rStyle w:val="VerbatimChar"/>
+        </w:rPr>
+        <w:t xml:space="preserve">## Welcome to emmeans.</w:t>
+      </w:r>
+      <w:r>
+        <w:br/>
+      </w:r>
+      <w:r>
+        <w:rPr>
+          <w:rStyle w:val="VerbatimChar"/>
+        </w:rPr>
+        <w:t xml:space="preserve">## Caution: You lose important information if you filter this package's results.</w:t>
+      </w:r>
+      <w:r>
+        <w:br/>
+      </w:r>
+      <w:r>
+        <w:rPr>
+          <w:rStyle w:val="VerbatimChar"/>
+        </w:rPr>
+        <w:t xml:space="preserve">## See '? untidy'</w:t>
+      </w:r>
+      <w:r>
+        <w:br/>
+      </w:r>
+      <w:r>
+        <w:rPr>
+          <w:rStyle w:val="VerbatimChar"/>
+        </w:rPr>
+        <w:t xml:space="preserve">## </w:t>
+      </w:r>
+      <w:r>
+        <w:br/>
+      </w:r>
+      <w:r>
+        <w:rPr>
+          <w:rStyle w:val="VerbatimChar"/>
+        </w:rPr>
+        <w:t xml:space="preserve">## This is DHARMa 0.4.7. For overview type '?DHARMa'. For recent changes, type news(package = 'DHARMa')</w:t>
       </w:r>
     </w:p>
     <w:bookmarkStart w:id="47" w:name="Xbd56f8ccfef5eec08285548f6527e18137e9787"/>
@@ -504,7 +740,7 @@
               <a:graphicData uri="http://schemas.openxmlformats.org/drawingml/2006/picture">
                 <pic:pic>
                   <pic:nvPicPr>
-                    <pic:cNvPr descr="C:\Users\ELVIRE~1.BES\DOCUME~1\AUTRES~1\WORKSH~2\DISPNE~1\Celina\DISPNE~1\KNITTE~1\APHANO~1/figure-docx/transformedfitnessnormal-1.png" id="18" name="Picture"/>
+                    <pic:cNvPr descr="C:\Users\elvire.bestion\Documents\Autres%20projets\Workshop%20evenet\dispnet_tempdisp\Celina\DispNet-Temperature-Dependent-Dispersal\Knitted_Markdowns\Aphanomyces_euteiches_multiple_strains_files/figure-docx/transformedfitnessnormal-1.png" id="18" name="Picture"/>
                     <pic:cNvPicPr>
                       <a:picLocks noChangeArrowheads="1" noChangeAspect="1"/>
                     </pic:cNvPicPr>
@@ -559,7 +795,7 @@
               <a:graphicData uri="http://schemas.openxmlformats.org/drawingml/2006/picture">
                 <pic:pic>
                   <pic:nvPicPr>
-                    <pic:cNvPr descr="C:\Users\ELVIRE~1.BES\DOCUME~1\AUTRES~1\WORKSH~2\DISPNE~1\Celina\DISPNE~1\KNITTE~1\APHANO~1/figure-docx/fitnessplotnormal-1.png" id="21" name="Picture"/>
+                    <pic:cNvPr descr="C:\Users\elvire.bestion\Documents\Autres%20projets\Workshop%20evenet\dispnet_tempdisp\Celina\DispNet-Temperature-Dependent-Dispersal\Knitted_Markdowns\Aphanomyces_euteiches_multiple_strains_files/figure-docx/fitnessplotnormal-1.png" id="21" name="Picture"/>
                     <pic:cNvPicPr>
                       <a:picLocks noChangeArrowheads="1" noChangeAspect="1"/>
                     </pic:cNvPicPr>
@@ -897,34 +1133,34 @@
         <w:rPr>
           <w:rStyle w:val="VerbatimChar"/>
         </w:rPr>
-        <w:t xml:space="preserve">##  contrast     estimate       SE df lower.CL  upper.CL t.ratio p.value</w:t>
-      </w:r>
-      <w:r>
-        <w:br/>
-      </w:r>
-      <w:r>
-        <w:rPr>
-          <w:rStyle w:val="VerbatimChar"/>
-        </w:rPr>
-        <w:t xml:space="preserve">##  high2 - low2  0.01143 0.000546 32  0.01031  0.012539  20.921  &lt;.0001</w:t>
-      </w:r>
-      <w:r>
-        <w:br/>
-      </w:r>
-      <w:r>
-        <w:rPr>
-          <w:rStyle w:val="VerbatimChar"/>
-        </w:rPr>
-        <w:t xml:space="preserve">##  high2 - opt2 -0.00124 0.000736 32 -0.00274  0.000256  -1.690  0.1008</w:t>
-      </w:r>
-      <w:r>
-        <w:br/>
-      </w:r>
-      <w:r>
-        <w:rPr>
-          <w:rStyle w:val="VerbatimChar"/>
-        </w:rPr>
-        <w:t xml:space="preserve">##  low2 - opt2  -0.01267 0.000577 32 -0.01384 -0.011496 -21.976  &lt;.0001</w:t>
+        <w:t xml:space="preserve">##  contrast     estimate       SE df  lower.CL upper.CL t.ratio p.value</w:t>
+      </w:r>
+      <w:r>
+        <w:br/>
+      </w:r>
+      <w:r>
+        <w:rPr>
+          <w:rStyle w:val="VerbatimChar"/>
+        </w:rPr>
+        <w:t xml:space="preserve">##  opt2 - high2  0.00124 0.000736 32 -0.000256  0.00274   1.690  0.1008</w:t>
+      </w:r>
+      <w:r>
+        <w:br/>
+      </w:r>
+      <w:r>
+        <w:rPr>
+          <w:rStyle w:val="VerbatimChar"/>
+        </w:rPr>
+        <w:t xml:space="preserve">##  opt2 - low2   0.01267 0.000577 32  0.011496  0.01384  21.976  &lt;.0001</w:t>
+      </w:r>
+      <w:r>
+        <w:br/>
+      </w:r>
+      <w:r>
+        <w:rPr>
+          <w:rStyle w:val="VerbatimChar"/>
+        </w:rPr>
+        <w:t xml:space="preserve">##  high2 - low2  0.01143 0.000546 32  0.010314  0.01254  20.921  &lt;.0001</w:t>
       </w:r>
       <w:r>
         <w:br/>
@@ -986,7 +1222,7 @@
               <a:graphicData uri="http://schemas.openxmlformats.org/drawingml/2006/picture">
                 <pic:pic>
                   <pic:nvPicPr>
-                    <pic:cNvPr descr="C:\Users\ELVIRE~1.BES\DOCUME~1\AUTRES~1\WORKSH~2\DISPNE~1\Celina\DISPNE~1\KNITTE~1\APHANO~1/figure-docx/dispersalplot-1.png" id="27" name="Picture"/>
+                    <pic:cNvPr descr="C:\Users\elvire.bestion\Documents\Autres%20projets\Workshop%20evenet\dispnet_tempdisp\Celina\DispNet-Temperature-Dependent-Dispersal\Knitted_Markdowns\Aphanomyces_euteiches_multiple_strains_files/figure-docx/dispersalplot-1.png" id="27" name="Picture"/>
                     <pic:cNvPicPr>
                       <a:picLocks noChangeArrowheads="1" noChangeAspect="1"/>
                     </pic:cNvPicPr>
@@ -1335,25 +1571,25 @@
         <w:rPr>
           <w:rStyle w:val="VerbatimChar"/>
         </w:rPr>
-        <w:t xml:space="preserve">##  high2 / low2       1.05 0.649 Inf     0.312      3.52    1   0.078  0.9378</w:t>
-      </w:r>
-      <w:r>
-        <w:br/>
-      </w:r>
-      <w:r>
-        <w:rPr>
-          <w:rStyle w:val="VerbatimChar"/>
-        </w:rPr>
-        <w:t xml:space="preserve">##  high2 / opt2       2.64 1.861 Inf     0.661     10.52    1   1.374  0.1695</w:t>
-      </w:r>
-      <w:r>
-        <w:br/>
-      </w:r>
-      <w:r>
-        <w:rPr>
-          <w:rStyle w:val="VerbatimChar"/>
-        </w:rPr>
-        <w:t xml:space="preserve">##  low2 / opt2        2.51 1.391 Inf     0.849      7.44    1   1.665  0.0959</w:t>
+        <w:t xml:space="preserve">##  opt2 / high2      0.379 0.268 Inf    0.0951      1.51    1  -1.374  0.1695</w:t>
+      </w:r>
+      <w:r>
+        <w:br/>
+      </w:r>
+      <w:r>
+        <w:rPr>
+          <w:rStyle w:val="VerbatimChar"/>
+        </w:rPr>
+        <w:t xml:space="preserve">##  opt2 / low2       0.398 0.220 Inf    0.1345      1.18    1  -1.665  0.0959</w:t>
+      </w:r>
+      <w:r>
+        <w:br/>
+      </w:r>
+      <w:r>
+        <w:rPr>
+          <w:rStyle w:val="VerbatimChar"/>
+        </w:rPr>
+        <w:t xml:space="preserve">##  high2 / low2      1.049 0.649 Inf    0.3124      3.52    1   0.078  0.9378</w:t>
       </w:r>
       <w:r>
         <w:br/>
@@ -1434,7 +1670,7 @@
               <a:graphicData uri="http://schemas.openxmlformats.org/drawingml/2006/picture">
                 <pic:pic>
                   <pic:nvPicPr>
-                    <pic:cNvPr descr="C:\Users\ELVIRE~1.BES\DOCUME~1\AUTRES~1\WORKSH~2\DISPNE~1\Celina\DISPNE~1\KNITTE~1\APHANO~1/figure-docx/modeldiagnosticsfitness-1.png" id="33" name="Picture"/>
+                    <pic:cNvPr descr="C:\Users\elvire.bestion\Documents\Autres%20projets\Workshop%20evenet\dispnet_tempdisp\Celina\DispNet-Temperature-Dependent-Dispersal\Knitted_Markdowns\Aphanomyces_euteiches_multiple_strains_files/figure-docx/modeldiagnosticsfitness-1.png" id="33" name="Picture"/>
                     <pic:cNvPicPr>
                       <a:picLocks noChangeArrowheads="1" noChangeAspect="1"/>
                     </pic:cNvPicPr>
@@ -1476,7 +1712,7 @@
               <a:graphicData uri="http://schemas.openxmlformats.org/drawingml/2006/picture">
                 <pic:pic>
                   <pic:nvPicPr>
-                    <pic:cNvPr descr="C:\Users\ELVIRE~1.BES\DOCUME~1\AUTRES~1\WORKSH~2\DISPNE~1\Celina\DISPNE~1\KNITTE~1\APHANO~1/figure-docx/modeldiagnosticsfitness-2.png" id="36" name="Picture"/>
+                    <pic:cNvPr descr="C:\Users\elvire.bestion\Documents\Autres%20projets\Workshop%20evenet\dispnet_tempdisp\Celina\DispNet-Temperature-Dependent-Dispersal\Knitted_Markdowns\Aphanomyces_euteiches_multiple_strains_files/figure-docx/modeldiagnosticsfitness-2.png" id="36" name="Picture"/>
                     <pic:cNvPicPr>
                       <a:picLocks noChangeArrowheads="1" noChangeAspect="1"/>
                     </pic:cNvPicPr>
@@ -1608,7 +1844,7 @@
               <a:graphicData uri="http://schemas.openxmlformats.org/drawingml/2006/picture">
                 <pic:pic>
                   <pic:nvPicPr>
-                    <pic:cNvPr descr="C:\Users\ELVIRE~1.BES\DOCUME~1\AUTRES~1\WORKSH~2\DISPNE~1\Celina\DISPNE~1\KNITTE~1\APHANO~1/figure-docx/modeldiagnosticsdispersal-1.png" id="40" name="Picture"/>
+                    <pic:cNvPr descr="C:\Users\elvire.bestion\Documents\Autres%20projets\Workshop%20evenet\dispnet_tempdisp\Celina\DispNet-Temperature-Dependent-Dispersal\Knitted_Markdowns\Aphanomyces_euteiches_multiple_strains_files/figure-docx/modeldiagnosticsdispersal-1.png" id="40" name="Picture"/>
                     <pic:cNvPicPr>
                       <a:picLocks noChangeArrowheads="1" noChangeAspect="1"/>
                     </pic:cNvPicPr>
@@ -1650,7 +1886,7 @@
               <a:graphicData uri="http://schemas.openxmlformats.org/drawingml/2006/picture">
                 <pic:pic>
                   <pic:nvPicPr>
-                    <pic:cNvPr descr="C:\Users\ELVIRE~1.BES\DOCUME~1\AUTRES~1\WORKSH~2\DISPNE~1\Celina\DISPNE~1\KNITTE~1\APHANO~1/figure-docx/modeldiagnosticsdispersal-2.png" id="43" name="Picture"/>
+                    <pic:cNvPr descr="C:\Users\elvire.bestion\Documents\Autres%20projets\Workshop%20evenet\dispnet_tempdisp\Celina\DispNet-Temperature-Dependent-Dispersal\Knitted_Markdowns\Aphanomyces_euteiches_multiple_strains_files/figure-docx/modeldiagnosticsdispersal-2.png" id="43" name="Picture"/>
                     <pic:cNvPicPr>
                       <a:picLocks noChangeArrowheads="1" noChangeAspect="1"/>
                     </pic:cNvPicPr>

</xml_diff>